<commit_message>
Draft_050: final-defense Methodology tense + step e bold structure
Corpus/sampling verbs to past; Research Process step e matched a–d.
</commit_message>
<xml_diff>
--- a/thesis/003_ThesisProposal_Draft_050.docx
+++ b/thesis/003_ThesisProposal_Draft_050.docx
@@ -1452,7 +1452,7 @@
           <w:szCs w:val="22"/>
           <w:rtl w:val="0"/>
         </w:rPr>
-        <w:t>This study focuses on undergraduate thesis abstracts from Agriculture, Veterinary Medicine, and Biology at PSAU. The inclusion window refers to the year of hard-bound submission as recorded in the PSAU library catalog, not the year the research was conducted. Theses conducted earlier but bound and catalogued in 2023–2025 are included. This reflects institutional practice in which submission date, particularly for irregular students, may postdate the research period by several years. The corpus consists of 60 abstracts (20 per discipline, with Agriculture split evenly between Crop Science and Animal Science). Sampling design, stratum intervals, and inclusion/exclusion criteria are detailed under Research Corpus. Table 1 reports population and sample sizes. Sub-programs are analyzed as a single “Agriculture” discipline for cross-disciplinary comparison. No separate inferential comparison between them is undertaken.</w:t>
+        <w:t>This study focuses on undergraduate thesis abstracts from Agriculture, Veterinary Medicine, and Biology at PSAU. The inclusion window refers to the year of hard-bound submission as recorded in the PSAU library catalog, not the year the research was conducted. Theses conducted earlier but bound and catalogued in 2023–2025 are included. This reflects institutional practice in which submission date, particularly for irregular students, may postdate the research period by several years. The corpus consisted of 60 abstracts (20 per discipline, with Agriculture split evenly between Crop Science and Animal Science). Sampling design, stratum intervals, and inclusion/exclusion criteria are detailed under Research Corpus. Table 1 reports population and sample sizes. Sub-programs are analyzed as a single “Agriculture” discipline for cross-disciplinary comparison. No separate inferential comparison between them is undertaken.</w:t>
       </w:r>
       <w:r>
         <w:rPr>
@@ -2771,6 +2771,9 @@
         <w:rPr/>
       </w:pPr>
       <w:r>
+        <w:t xml:space="preserve">e. Data Analysis. </w:t>
+      </w:r>
+      <w:r>
         <w:rPr>
           <w:rFonts w:ascii="Georgia" w:hAnsi="Georgia" w:cs="Georgia" w:eastAsia="Georgia"/>
           <w:i w:val="0"/>
@@ -2778,28 +2781,10 @@
           <w:sz w:val="22"/>
           <w:szCs w:val="22"/>
           <w:rtl w:val="0"/>
-          <w:b/>
-          <w:bCs/>
-        </w:rPr>
-        <w:t xml:space="preserve">e. Data Analysis. Hedge identification, type classification, and functional coding were all conducted manually using a Google Sheets coding template. Each abstract was read in full before coding began to ensure hedges were interpreted in context rather than flagged as isolated tokens. Ambiguous cases were resolved using the predefined decision tree in Appendix A. Frequency counts were normalized per 100 words to enable comparison across abstracts of varying length. In a separate pass, each abstract was also coded for outcome type from its results language (Binary, Continuous, Mixed, Null/NS, Other), so that density patterns could be read against the kind of finding reported. Those codes are recorded in the coding spreadsheet and discussed in Part IV. While the quantitative analysis identified what hedges were used, the qualitative interpretation applied Salager-Meyer’s (1994) claim-responsibility framework and Hyland’s (2005) stance model to explain why these patterns occurred. Given the corpus size, findings were interpreted as indicative patterns within the PSAU context, supplemented by exploratory inferential analyses (chi-square, Kruskal-Wallis) whose results are reported transparently but should not be treated as confirmatory given the small, zero-inflated sample.</w:t>
-      </w:r>
-      <w:r>
-        <w:rPr>
-          <w:rFonts w:ascii="Georgia" w:hAnsi="Georgia" w:cs="Georgia" w:eastAsia="Georgia"/>
-          <w:i w:val="0"/>
-          <w:iCs w:val="0"/>
-          <w:sz w:val="22"/>
-          <w:szCs w:val="22"/>
-          <w:rtl w:val="0"/>
-          <w:b w:val="0"/>
-          <w:bCs w:val="0"/>
-        </w:rPr>
-        <w:t/>
-      </w:r>
-      <w:r>
-        <w:rPr>
-          <w:rtl w:val="0"/>
-        </w:rPr>
+          <w:b w:val="0"/>
+          <w:bCs w:val="0"/>
+        </w:rPr>
+        <w:t xml:space="preserve">Hedge identification, type classification, and functional coding were all conducted manually using a Google Sheets coding template. Each abstract was read in full before coding began to ensure hedges were interpreted in context rather than flagged as isolated tokens. Ambiguous cases were resolved using the predefined decision tree in Appendix A. Frequency counts were normalized per 100 words to enable comparison across abstracts of varying length. In a separate pass, each abstract was also coded for outcome type from its results language (Binary, Continuous, Mixed, Null/NS, Other), so that density patterns could be read against the kind of finding reported. Those codes are recorded in the coding spreadsheet and discussed in Part IV. While the quantitative analysis identified what hedges were used, the qualitative interpretation applied Salager-Meyer’s (1994) claim-responsibility framework and Hyland’s (2005) stance model to explain why these patterns occurred. Given the corpus size, findings were interpreted as indicative patterns within the PSAU context, supplemented by exploratory inferential analyses (chi-square, Kruskal-Wallis) whose results are reported transparently but should not be treated as confirmatory given the small, zero-inflated sample.</w:t>
       </w:r>
     </w:p>
     <w:p>
@@ -2939,7 +2924,7 @@
           <w:szCs w:val="22"/>
           <w:rtl w:val="0"/>
         </w:rPr>
-        <w:t>This study used a text corpus rather than human participants. The corpus consists of 60 undergraduate thesis abstracts from Agriculture, Veterinary Medicine, and Biology programs at PSAU. This study employed disproportionate stratified systematic sampling, with discipline as the stratification variable and fixed analytical targets per stratum (n=20 for Biology, n=20 for Veterinary Medicine, n=10 for Animal Science, and n=10 for Crop Science) to ensure equal representation regardless of population size. This means the sampling rate varies by population size, prioritizing equal sample sizes over proportional representation. For the Agriculture discipline, the sample is equally split between Crop Science (n=10) and Animal Science (n=10) to ensure balanced representation of the sub-disciplines. Within each stratum, a sampling interval k was calculated as k = N/n. The intervals were Biology k=7 (145÷20=7.25), Veterinary Medicine k=5 (104÷20=5.2), Animal Science k=4 (38÷10=3.8), and Crop Science k=9 (94÷10=9.4). Sampling began from a randomly selected position around the middle of each stratum’s catalog, proceeded forward by taking every kth thesis, and wrapped around to the beginning of the catalog when needed until the target sample was met. This sample size is appropriate for the study’s scope. Khunasathitchai et al. (2025) used 60 abstracts in a comparable corpus study. Wang (2022) examined a much larger multi-field student corpus. The present study does not claim comparable scale. For a manually coded functional analysis at a single institution, 60 texts allow sufficient depth of interpretation within the timeframe and resources of a BA thesis. The study treats findings as baseline descriptive data for institutional curriculum review.</w:t>
+        <w:t>This study used a text corpus rather than human participants. The corpus consisted of 60 undergraduate thesis abstracts from Agriculture, Veterinary Medicine, and Biology programs at PSAU. This study employed disproportionate stratified systematic sampling, with discipline as the stratification variable and fixed analytical targets per stratum (n=20 for Biology, n=20 for Veterinary Medicine, n=10 for Animal Science, and n=10 for Crop Science) to ensure equal representation regardless of population size. This meant the sampling rate varied by population size, prioritizing equal sample sizes over proportional representation. For the Agriculture discipline, the sample was equally split between Crop Science (n=10) and Animal Science (n=10) to ensure balanced representation of the sub-disciplines. Within each stratum, a sampling interval k was calculated as k = N/n. The intervals were Biology k=7 (145÷20=7.25), Veterinary Medicine k=5 (104÷20=5.2), Animal Science k=4 (38÷10=3.8), and Crop Science k=9 (94÷10=9.4). Sampling began from a randomly selected position around the middle of each stratum’s catalog, proceeded forward by taking every kth thesis, and wrapped around to the beginning of the catalog when needed until the target sample was met. This sample size is appropriate for the study’s scope. Khunasathitchai et al. (2025) used 60 abstracts in a comparable corpus study. Wang (2022) examined a much larger multi-field student corpus. The present study does not claim comparable scale. For a manually coded functional analysis at a single institution, 60 texts allow sufficient depth of interpretation within the timeframe and resources of a BA thesis. The study treated findings as baseline descriptive data for institutional curriculum review.</w:t>
       </w:r>
       <w:r>
         <w:rPr>
@@ -16884,7 +16869,7 @@
           <w:szCs w:val="22"/>
           <w:rtl w:val="0"/>
         </w:rPr>
-        <w:t>Extensions: “imply/implies/implying” functions as suggest. “Can be concluded / derived / stated / attributed to / seen as” is an inferential hedge, distinct from capability “can” (see Decision Rules). “Potentially” is an adverbial hedge. “Potential” naming the research object itself (e.g., “assessed the potential of X”) is not markable, it names a topic rather than qualifying a claim. Rule for “potential + noun” constructions: structural position is primary. If the phrase sits in an aim, methods, or pure topic-naming frame (naming the research object, e.g., “assessed the potential of X”), treat as topic-naming (FP-Gen). If it sits in a results or conclusion sentence qualifying a finding-claim, treat as a Lexical hedge (EC). The Working Test is applied as a secondary check: when removing the token clearly changes commitment to a proposition (e.g., "presence of potential mycobacterial infections" becomes "presence of mycobacterial infections"), the token is coded Lexical EC even in an aim or rationale sentence. Pure topic-naming aims leave a research-object name when the token is removed and remain FP-Gen. </w:t>
+        <w:t xml:space="preserve">Extensions: “imply/implies/implying” functions as suggest. “Can be concluded / derived / stated / attributed to / seen as” is an inferential hedge, distinct from capability “can” (see Decision Rules). “Potentially” is an adverbial hedge. “Potential” naming the research object itself (e.g., “assessed the potential of X”) is not markable, it names a topic rather than qualifying a claim. Rule for “potential + noun” constructions: structural position is primary. If the phrase sits in an aim, methods, or pure topic-naming frame (naming the research object, e.g., “assessed the potential of X”), treat as topic-naming (FP-Gen). If it sits in a results or conclusion sentence qualifying a finding-claim, treat as a Lexical hedge (EC). The Working Test is applied as a secondary check: when removing the token clearly changes commitment to a proposition (e.g., "presence of potential mycobacterial infections" becomes "presence of mycobacterial infections"), the token is coded Lexical EC even in an aim or rationale sentence. Pure topic-naming aims leave a research-object name when the token is removed and remain FP-Gen. </w:t>
       </w:r>
       <w:r>
         <w:rPr>

</xml_diff>

<commit_message>
Draft_050: add Rescue-Hedging to Definition of Terms
</commit_message>
<xml_diff>
--- a/thesis/003_ThesisProposal_Draft_050.docx
+++ b/thesis/003_ThesisProposal_Draft_050.docx
@@ -2290,6 +2290,45 @@
           <w:rtl w:val="0"/>
         </w:rPr>
         <w:t xml:space="preserve">conceptually, normalized frequency is a statistical method used to compare linguistic features across texts of different lengths by standardizing the count to a base unit. Operationally, this refers to the formula used in this study to compare hedge usage: Normalized Frequency = (Total Hedges / Total Word Count) x 100. For example, if an abstract contains 3 hedges and 258 words, the normalized frequency is (3/258) x 100 = 1.16 hedges per 100 words.</w:t>
+      </w:r>
+      <w:r>
+        <w:rPr>
+          <w:rtl w:val="0"/>
+        </w:rPr>
+      </w:r>
+    </w:p>
+    <w:p>
+      <w:pPr>
+        <w:spacing w:before="0" w:after="0" w:line="480" w:lineRule="auto"/>
+        <w:ind w:firstLine="720"/>
+        <w:jc w:val="both"/>
+        <w:rPr/>
+      </w:pPr>
+      <w:r>
+        <w:rPr>
+          <w:rFonts w:ascii="Georgia" w:cs="Georgia" w:eastAsia="Georgia" w:hAnsi="Georgia"/>
+          <w:b w:val="1"/>
+          <w:bCs w:val="1"/>
+          <w:i w:val="0"/>
+          <w:iCs w:val="0"/>
+          <w:sz w:val="22"/>
+          <w:szCs w:val="22"/>
+          <w:rtl w:val="0"/>
+        </w:rPr>
+        <w:t xml:space="preserve">Rescue-Hedging (Rescue Framing), </w:t>
+      </w:r>
+      <w:r>
+        <w:rPr>
+          <w:rFonts w:ascii="Georgia" w:cs="Georgia" w:eastAsia="Georgia" w:hAnsi="Georgia"/>
+          <w:b w:val="0"/>
+          <w:bCs w:val="0"/>
+          <w:i w:val="0"/>
+          <w:iCs w:val="0"/>
+          <w:sz w:val="22"/>
+          <w:szCs w:val="22"/>
+          <w:rtl w:val="0"/>
+        </w:rPr>
+        <w:t xml:space="preserve">conceptually, the use of hedges after an explicit non-significant result so that a treatment or finding is still presented as potentially beneficial. Operationally, the term is used in this study as a descriptive label for that pattern.</w:t>
       </w:r>
       <w:r>
         <w:rPr>

</xml_diff>